<commit_message>
Report Generation Feature Updated
</commit_message>
<xml_diff>
--- a/public/template/Zakat_Report_Professional.docx
+++ b/public/template/Zakat_Report_Professional.docx
@@ -23,12 +23,6 @@
         <w:gridCol w:w="10100"/>
       </w:tblGrid>
       <w:tr>
-        <w:tblPrEx>
-          <w:tblCellMar>
-            <w:top w:w="0" w:type="dxa"/>
-            <w:bottom w:w="0" w:type="dxa"/>
-          </w:tblCellMar>
-        </w:tblPrEx>
         <w:trPr>
           <w:trHeight w:val="976"/>
         </w:trPr>
@@ -183,12 +177,6 @@
         <w:gridCol w:w="10027"/>
       </w:tblGrid>
       <w:tr>
-        <w:tblPrEx>
-          <w:tblCellMar>
-            <w:top w:w="0" w:type="dxa"/>
-            <w:bottom w:w="0" w:type="dxa"/>
-          </w:tblCellMar>
-        </w:tblPrEx>
         <w:trPr>
           <w:trHeight w:val="973"/>
         </w:trPr>
@@ -271,6 +259,35 @@
                 <w:sz w:val="20"/>
                 <w:szCs w:val="20"/>
               </w:rPr>
+              <w:t xml:space="preserve"> {type}</w:t>
+            </w:r>
+            <w:r>
+              <w:rPr>
+                <w:rFonts w:ascii="Shonar Bangla" w:eastAsia="SutonnyMJ" w:hAnsi="Shonar Bangla" w:cs="Shonar Bangla"/>
+                <w:color w:val="2E6B45"/>
+                <w:sz w:val="20"/>
+                <w:szCs w:val="20"/>
+              </w:rPr>
+              <w:t xml:space="preserve"> </w:t>
+            </w:r>
+            <w:proofErr w:type="spellStart"/>
+            <w:r>
+              <w:rPr>
+                <w:rFonts w:ascii="Shonar Bangla" w:eastAsia="SutonnyMJ" w:hAnsi="Shonar Bangla" w:cs="Shonar Bangla"/>
+                <w:color w:val="2E6B45"/>
+                <w:sz w:val="20"/>
+                <w:szCs w:val="20"/>
+              </w:rPr>
+              <w:t>জন্য</w:t>
+            </w:r>
+            <w:proofErr w:type="spellEnd"/>
+            <w:r>
+              <w:rPr>
+                <w:rFonts w:ascii="SutonnyMJ" w:eastAsia="SutonnyMJ" w:hAnsi="SutonnyMJ" w:cs="SutonnyMJ"/>
+                <w:color w:val="2E6B45"/>
+                <w:sz w:val="20"/>
+                <w:szCs w:val="20"/>
+              </w:rPr>
               <w:t>:</w:t>
             </w:r>
           </w:p>
@@ -661,6 +678,38 @@
           <w:rFonts w:ascii="SutonnyMJ" w:eastAsia="SutonnyMJ" w:hAnsi="SutonnyMJ" w:cs="SutonnyMJ"/>
           <w:color w:val="444444"/>
         </w:rPr>
+        <w:t xml:space="preserve"> {</w:t>
+      </w:r>
+      <w:proofErr w:type="spellStart"/>
+      <w:r>
+        <w:rPr>
+          <w:rFonts w:ascii="SutonnyMJ" w:eastAsia="SutonnyMJ" w:hAnsi="SutonnyMJ" w:cs="SutonnyMJ"/>
+          <w:color w:val="444444"/>
+        </w:rPr>
+        <w:t>client_name</w:t>
+      </w:r>
+      <w:proofErr w:type="spellEnd"/>
+      <w:r>
+        <w:rPr>
+          <w:rFonts w:ascii="SutonnyMJ" w:eastAsia="SutonnyMJ" w:hAnsi="SutonnyMJ" w:cs="SutonnyMJ"/>
+          <w:color w:val="444444"/>
+        </w:rPr>
+        <w:t>}-</w:t>
+      </w:r>
+      <w:proofErr w:type="spellStart"/>
+      <w:r>
+        <w:rPr>
+          <w:rFonts w:ascii="SutonnyMJ" w:eastAsia="SutonnyMJ" w:hAnsi="SutonnyMJ" w:cs="SutonnyMJ"/>
+          <w:color w:val="444444"/>
+        </w:rPr>
+        <w:t>এর</w:t>
+      </w:r>
+      <w:proofErr w:type="spellEnd"/>
+      <w:r>
+        <w:rPr>
+          <w:rFonts w:ascii="SutonnyMJ" w:eastAsia="SutonnyMJ" w:hAnsi="SutonnyMJ" w:cs="SutonnyMJ"/>
+          <w:color w:val="444444"/>
+        </w:rPr>
         <w:t xml:space="preserve"> </w:t>
       </w:r>
       <w:proofErr w:type="spellStart"/>
@@ -669,39 +718,7 @@
           <w:rFonts w:ascii="SutonnyMJ" w:eastAsia="SutonnyMJ" w:hAnsi="SutonnyMJ" w:cs="SutonnyMJ"/>
           <w:color w:val="444444"/>
         </w:rPr>
-        <w:t>মুহতারাম</w:t>
-      </w:r>
-      <w:proofErr w:type="spellEnd"/>
-      <w:r>
-        <w:rPr>
-          <w:rFonts w:ascii="SutonnyMJ" w:eastAsia="SutonnyMJ" w:hAnsi="SutonnyMJ" w:cs="SutonnyMJ"/>
-          <w:color w:val="444444"/>
-        </w:rPr>
-        <w:t xml:space="preserve"> {</w:t>
-      </w:r>
-      <w:proofErr w:type="spellStart"/>
-      <w:r>
-        <w:rPr>
-          <w:rFonts w:ascii="SutonnyMJ" w:eastAsia="SutonnyMJ" w:hAnsi="SutonnyMJ" w:cs="SutonnyMJ"/>
-          <w:color w:val="444444"/>
-        </w:rPr>
-        <w:t>client_name</w:t>
-      </w:r>
-      <w:proofErr w:type="spellEnd"/>
-      <w:r>
-        <w:rPr>
-          <w:rFonts w:ascii="SutonnyMJ" w:eastAsia="SutonnyMJ" w:hAnsi="SutonnyMJ" w:cs="SutonnyMJ"/>
-          <w:color w:val="444444"/>
-        </w:rPr>
-        <w:t>}-</w:t>
-      </w:r>
-      <w:proofErr w:type="spellStart"/>
-      <w:r>
-        <w:rPr>
-          <w:rFonts w:ascii="SutonnyMJ" w:eastAsia="SutonnyMJ" w:hAnsi="SutonnyMJ" w:cs="SutonnyMJ"/>
-          <w:color w:val="444444"/>
-        </w:rPr>
-        <w:t>এর</w:t>
+        <w:t>যাকাতের</w:t>
       </w:r>
       <w:proofErr w:type="spellEnd"/>
       <w:r>
@@ -717,7 +734,7 @@
           <w:rFonts w:ascii="SutonnyMJ" w:eastAsia="SutonnyMJ" w:hAnsi="SutonnyMJ" w:cs="SutonnyMJ"/>
           <w:color w:val="444444"/>
         </w:rPr>
-        <w:t>যাকাতের</w:t>
+        <w:t>বিবরণ</w:t>
       </w:r>
       <w:proofErr w:type="spellEnd"/>
       <w:r>
@@ -733,22 +750,6 @@
           <w:rFonts w:ascii="SutonnyMJ" w:eastAsia="SutonnyMJ" w:hAnsi="SutonnyMJ" w:cs="SutonnyMJ"/>
           <w:color w:val="444444"/>
         </w:rPr>
-        <w:t>বিবরণ</w:t>
-      </w:r>
-      <w:proofErr w:type="spellEnd"/>
-      <w:r>
-        <w:rPr>
-          <w:rFonts w:ascii="SutonnyMJ" w:eastAsia="SutonnyMJ" w:hAnsi="SutonnyMJ" w:cs="SutonnyMJ"/>
-          <w:color w:val="444444"/>
-        </w:rPr>
-        <w:t xml:space="preserve"> </w:t>
-      </w:r>
-      <w:proofErr w:type="spellStart"/>
-      <w:r>
-        <w:rPr>
-          <w:rFonts w:ascii="SutonnyMJ" w:eastAsia="SutonnyMJ" w:hAnsi="SutonnyMJ" w:cs="SutonnyMJ"/>
-          <w:color w:val="444444"/>
-        </w:rPr>
         <w:t>নিম্নরূপ</w:t>
       </w:r>
       <w:proofErr w:type="spellEnd"/>
@@ -759,11 +760,6 @@
         </w:rPr>
         <w:t>:</w:t>
       </w:r>
-    </w:p>
-    <w:p>
-      <w:pPr>
-        <w:spacing w:after="160"/>
-      </w:pPr>
     </w:p>
     <w:tbl>
       <w:tblPr>
@@ -787,12 +783,6 @@
         <w:gridCol w:w="4161"/>
       </w:tblGrid>
       <w:tr>
-        <w:tblPrEx>
-          <w:tblCellMar>
-            <w:top w:w="0" w:type="dxa"/>
-            <w:bottom w:w="0" w:type="dxa"/>
-          </w:tblCellMar>
-        </w:tblPrEx>
         <w:trPr>
           <w:trHeight w:val="416"/>
         </w:trPr>
@@ -909,12 +899,6 @@
         </w:tc>
       </w:tr>
       <w:tr>
-        <w:tblPrEx>
-          <w:tblCellMar>
-            <w:top w:w="0" w:type="dxa"/>
-            <w:bottom w:w="0" w:type="dxa"/>
-          </w:tblCellMar>
-        </w:tblPrEx>
         <w:trPr>
           <w:trHeight w:val="634"/>
         </w:trPr>
@@ -1128,12 +1112,6 @@
         </w:tc>
       </w:tr>
       <w:tr>
-        <w:tblPrEx>
-          <w:tblCellMar>
-            <w:top w:w="0" w:type="dxa"/>
-            <w:bottom w:w="0" w:type="dxa"/>
-          </w:tblCellMar>
-        </w:tblPrEx>
         <w:trPr>
           <w:trHeight w:val="696"/>
         </w:trPr>
@@ -1414,7 +1392,7 @@
     </w:p>
     <w:tbl>
       <w:tblPr>
-        <w:tblW w:w="9360" w:type="dxa"/>
+        <w:tblW w:w="10055" w:type="dxa"/>
         <w:tblBorders>
           <w:top w:val="single" w:sz="4" w:space="0" w:color="auto"/>
           <w:left w:val="single" w:sz="4" w:space="0" w:color="auto"/>
@@ -1430,18 +1408,12 @@
         <w:tblLook w:val="04A0" w:firstRow="1" w:lastRow="0" w:firstColumn="1" w:lastColumn="0" w:noHBand="0" w:noVBand="1"/>
       </w:tblPr>
       <w:tblGrid>
-        <w:gridCol w:w="9360"/>
+        <w:gridCol w:w="10055"/>
       </w:tblGrid>
       <w:tr>
-        <w:tblPrEx>
-          <w:tblCellMar>
-            <w:top w:w="0" w:type="dxa"/>
-            <w:bottom w:w="0" w:type="dxa"/>
-          </w:tblCellMar>
-        </w:tblPrEx>
         <w:tc>
           <w:tcPr>
-            <w:tcW w:w="0" w:type="auto"/>
+            <w:tcW w:w="10055" w:type="dxa"/>
             <w:tcBorders>
               <w:top w:val="none" w:sz="0" w:space="0" w:color="FFFFFF"/>
               <w:left w:val="single" w:sz="20" w:space="0" w:color="2E6B45"/>
@@ -2454,7 +2426,6 @@
         <w:spacing w:before="60" w:after="60" w:line="340" w:lineRule="auto"/>
         <w:jc w:val="both"/>
       </w:pPr>
-      <w:proofErr w:type="spellStart"/>
       <w:proofErr w:type="gramStart"/>
       <w:r>
         <w:rPr>
@@ -2463,6 +2434,16 @@
           <w:sz w:val="21"/>
           <w:szCs w:val="21"/>
         </w:rPr>
+        <w:t>{</w:t>
+      </w:r>
+      <w:proofErr w:type="spellStart"/>
+      <w:r>
+        <w:rPr>
+          <w:rFonts w:ascii="SutonnyMJ" w:eastAsia="SutonnyMJ" w:hAnsi="SutonnyMJ" w:cs="SutonnyMJ"/>
+          <w:color w:val="444444"/>
+          <w:sz w:val="21"/>
+          <w:szCs w:val="21"/>
+        </w:rPr>
         <w:t>আরো</w:t>
       </w:r>
       <w:proofErr w:type="spellEnd"/>
@@ -2513,7 +2494,7 @@
           <w:sz w:val="21"/>
           <w:szCs w:val="21"/>
         </w:rPr>
-        <w:t>, {</w:t>
+        <w:t>,} {</w:t>
       </w:r>
       <w:proofErr w:type="spellStart"/>
       <w:proofErr w:type="gramEnd"/>
@@ -2535,473 +2516,6 @@
           <w:szCs w:val="21"/>
         </w:rPr>
         <w:t>}</w:t>
-      </w:r>
-    </w:p>
-    <w:p>
-      <w:pPr>
-        <w:spacing w:after="80"/>
-      </w:pPr>
-    </w:p>
-    <w:p>
-      <w:pPr>
-        <w:spacing w:before="60" w:after="60" w:line="340" w:lineRule="auto"/>
-        <w:jc w:val="both"/>
-      </w:pPr>
-      <w:proofErr w:type="spellStart"/>
-      <w:r>
-        <w:rPr>
-          <w:rFonts w:ascii="SutonnyMJ" w:eastAsia="SutonnyMJ" w:hAnsi="SutonnyMJ" w:cs="SutonnyMJ"/>
-          <w:b/>
-          <w:bCs/>
-          <w:color w:val="1A3A2A"/>
-          <w:sz w:val="21"/>
-          <w:szCs w:val="21"/>
-        </w:rPr>
-        <w:t>বিঃ</w:t>
-      </w:r>
-      <w:proofErr w:type="spellEnd"/>
-      <w:r>
-        <w:rPr>
-          <w:rFonts w:ascii="SutonnyMJ" w:eastAsia="SutonnyMJ" w:hAnsi="SutonnyMJ" w:cs="SutonnyMJ"/>
-          <w:b/>
-          <w:bCs/>
-          <w:color w:val="1A3A2A"/>
-          <w:sz w:val="21"/>
-          <w:szCs w:val="21"/>
-        </w:rPr>
-        <w:t xml:space="preserve"> </w:t>
-      </w:r>
-      <w:proofErr w:type="spellStart"/>
-      <w:r>
-        <w:rPr>
-          <w:rFonts w:ascii="SutonnyMJ" w:eastAsia="SutonnyMJ" w:hAnsi="SutonnyMJ" w:cs="SutonnyMJ"/>
-          <w:b/>
-          <w:bCs/>
-          <w:color w:val="1A3A2A"/>
-          <w:sz w:val="21"/>
-          <w:szCs w:val="21"/>
-        </w:rPr>
-        <w:t>দ্রঃ</w:t>
-      </w:r>
-      <w:proofErr w:type="spellEnd"/>
-      <w:r>
-        <w:rPr>
-          <w:rFonts w:ascii="SutonnyMJ" w:eastAsia="SutonnyMJ" w:hAnsi="SutonnyMJ" w:cs="SutonnyMJ"/>
-          <w:b/>
-          <w:bCs/>
-          <w:color w:val="1A3A2A"/>
-          <w:sz w:val="21"/>
-          <w:szCs w:val="21"/>
-        </w:rPr>
-        <w:t xml:space="preserve"> </w:t>
-      </w:r>
-      <w:proofErr w:type="spellStart"/>
-      <w:r>
-        <w:rPr>
-          <w:rFonts w:ascii="SutonnyMJ" w:eastAsia="SutonnyMJ" w:hAnsi="SutonnyMJ" w:cs="SutonnyMJ"/>
-          <w:b/>
-          <w:bCs/>
-          <w:color w:val="1A3A2A"/>
-          <w:sz w:val="21"/>
-          <w:szCs w:val="21"/>
-        </w:rPr>
-        <w:t>যাকাতের</w:t>
-      </w:r>
-      <w:proofErr w:type="spellEnd"/>
-      <w:r>
-        <w:rPr>
-          <w:rFonts w:ascii="SutonnyMJ" w:eastAsia="SutonnyMJ" w:hAnsi="SutonnyMJ" w:cs="SutonnyMJ"/>
-          <w:b/>
-          <w:bCs/>
-          <w:color w:val="1A3A2A"/>
-          <w:sz w:val="21"/>
-          <w:szCs w:val="21"/>
-        </w:rPr>
-        <w:t xml:space="preserve"> </w:t>
-      </w:r>
-      <w:proofErr w:type="spellStart"/>
-      <w:r>
-        <w:rPr>
-          <w:rFonts w:ascii="SutonnyMJ" w:eastAsia="SutonnyMJ" w:hAnsi="SutonnyMJ" w:cs="SutonnyMJ"/>
-          <w:b/>
-          <w:bCs/>
-          <w:color w:val="1A3A2A"/>
-          <w:sz w:val="21"/>
-          <w:szCs w:val="21"/>
-        </w:rPr>
-        <w:t>অর্থ</w:t>
-      </w:r>
-      <w:proofErr w:type="spellEnd"/>
-      <w:r>
-        <w:rPr>
-          <w:rFonts w:ascii="SutonnyMJ" w:eastAsia="SutonnyMJ" w:hAnsi="SutonnyMJ" w:cs="SutonnyMJ"/>
-          <w:b/>
-          <w:bCs/>
-          <w:color w:val="1A3A2A"/>
-          <w:sz w:val="21"/>
-          <w:szCs w:val="21"/>
-        </w:rPr>
-        <w:t xml:space="preserve"> </w:t>
-      </w:r>
-      <w:proofErr w:type="spellStart"/>
-      <w:r>
-        <w:rPr>
-          <w:rFonts w:ascii="SutonnyMJ" w:eastAsia="SutonnyMJ" w:hAnsi="SutonnyMJ" w:cs="SutonnyMJ"/>
-          <w:b/>
-          <w:bCs/>
-          <w:color w:val="1A3A2A"/>
-          <w:sz w:val="21"/>
-          <w:szCs w:val="21"/>
-        </w:rPr>
-        <w:t>যাকাতের</w:t>
-      </w:r>
-      <w:proofErr w:type="spellEnd"/>
-      <w:r>
-        <w:rPr>
-          <w:rFonts w:ascii="SutonnyMJ" w:eastAsia="SutonnyMJ" w:hAnsi="SutonnyMJ" w:cs="SutonnyMJ"/>
-          <w:b/>
-          <w:bCs/>
-          <w:color w:val="1A3A2A"/>
-          <w:sz w:val="21"/>
-          <w:szCs w:val="21"/>
-        </w:rPr>
-        <w:t xml:space="preserve"> </w:t>
-      </w:r>
-      <w:proofErr w:type="spellStart"/>
-      <w:r>
-        <w:rPr>
-          <w:rFonts w:ascii="SutonnyMJ" w:eastAsia="SutonnyMJ" w:hAnsi="SutonnyMJ" w:cs="SutonnyMJ"/>
-          <w:b/>
-          <w:bCs/>
-          <w:color w:val="1A3A2A"/>
-          <w:sz w:val="21"/>
-          <w:szCs w:val="21"/>
-        </w:rPr>
-        <w:t>নির্ধারিত</w:t>
-      </w:r>
-      <w:proofErr w:type="spellEnd"/>
-      <w:r>
-        <w:rPr>
-          <w:rFonts w:ascii="SutonnyMJ" w:eastAsia="SutonnyMJ" w:hAnsi="SutonnyMJ" w:cs="SutonnyMJ"/>
-          <w:b/>
-          <w:bCs/>
-          <w:color w:val="1A3A2A"/>
-          <w:sz w:val="21"/>
-          <w:szCs w:val="21"/>
-        </w:rPr>
-        <w:t xml:space="preserve"> </w:t>
-      </w:r>
-      <w:proofErr w:type="spellStart"/>
-      <w:r>
-        <w:rPr>
-          <w:rFonts w:ascii="SutonnyMJ" w:eastAsia="SutonnyMJ" w:hAnsi="SutonnyMJ" w:cs="SutonnyMJ"/>
-          <w:b/>
-          <w:bCs/>
-          <w:color w:val="1A3A2A"/>
-          <w:sz w:val="21"/>
-          <w:szCs w:val="21"/>
-        </w:rPr>
-        <w:t>খাতে</w:t>
-      </w:r>
-      <w:proofErr w:type="spellEnd"/>
-      <w:r>
-        <w:rPr>
-          <w:rFonts w:ascii="SutonnyMJ" w:eastAsia="SutonnyMJ" w:hAnsi="SutonnyMJ" w:cs="SutonnyMJ"/>
-          <w:b/>
-          <w:bCs/>
-          <w:color w:val="1A3A2A"/>
-          <w:sz w:val="21"/>
-          <w:szCs w:val="21"/>
-        </w:rPr>
-        <w:t xml:space="preserve"> </w:t>
-      </w:r>
-      <w:proofErr w:type="spellStart"/>
-      <w:r>
-        <w:rPr>
-          <w:rFonts w:ascii="SutonnyMJ" w:eastAsia="SutonnyMJ" w:hAnsi="SutonnyMJ" w:cs="SutonnyMJ"/>
-          <w:b/>
-          <w:bCs/>
-          <w:color w:val="1A3A2A"/>
-          <w:sz w:val="21"/>
-          <w:szCs w:val="21"/>
-        </w:rPr>
-        <w:t>ব্যয়</w:t>
-      </w:r>
-      <w:proofErr w:type="spellEnd"/>
-      <w:r>
-        <w:rPr>
-          <w:rFonts w:ascii="SutonnyMJ" w:eastAsia="SutonnyMJ" w:hAnsi="SutonnyMJ" w:cs="SutonnyMJ"/>
-          <w:b/>
-          <w:bCs/>
-          <w:color w:val="1A3A2A"/>
-          <w:sz w:val="21"/>
-          <w:szCs w:val="21"/>
-        </w:rPr>
-        <w:t xml:space="preserve"> </w:t>
-      </w:r>
-      <w:proofErr w:type="spellStart"/>
-      <w:r>
-        <w:rPr>
-          <w:rFonts w:ascii="SutonnyMJ" w:eastAsia="SutonnyMJ" w:hAnsi="SutonnyMJ" w:cs="SutonnyMJ"/>
-          <w:b/>
-          <w:bCs/>
-          <w:color w:val="1A3A2A"/>
-          <w:sz w:val="21"/>
-          <w:szCs w:val="21"/>
-        </w:rPr>
-        <w:t>করতে</w:t>
-      </w:r>
-      <w:proofErr w:type="spellEnd"/>
-      <w:r>
-        <w:rPr>
-          <w:rFonts w:ascii="SutonnyMJ" w:eastAsia="SutonnyMJ" w:hAnsi="SutonnyMJ" w:cs="SutonnyMJ"/>
-          <w:b/>
-          <w:bCs/>
-          <w:color w:val="1A3A2A"/>
-          <w:sz w:val="21"/>
-          <w:szCs w:val="21"/>
-        </w:rPr>
-        <w:t xml:space="preserve"> </w:t>
-      </w:r>
-      <w:proofErr w:type="spellStart"/>
-      <w:r>
-        <w:rPr>
-          <w:rFonts w:ascii="SutonnyMJ" w:eastAsia="SutonnyMJ" w:hAnsi="SutonnyMJ" w:cs="SutonnyMJ"/>
-          <w:b/>
-          <w:bCs/>
-          <w:color w:val="1A3A2A"/>
-          <w:sz w:val="21"/>
-          <w:szCs w:val="21"/>
-        </w:rPr>
-        <w:t>হবে</w:t>
-      </w:r>
-      <w:proofErr w:type="spellEnd"/>
-      <w:r>
-        <w:rPr>
-          <w:rFonts w:ascii="SutonnyMJ" w:eastAsia="SutonnyMJ" w:hAnsi="SutonnyMJ" w:cs="SutonnyMJ"/>
-          <w:b/>
-          <w:bCs/>
-          <w:color w:val="1A3A2A"/>
-          <w:sz w:val="21"/>
-          <w:szCs w:val="21"/>
-        </w:rPr>
-        <w:t xml:space="preserve">। এ </w:t>
-      </w:r>
-      <w:proofErr w:type="spellStart"/>
-      <w:r>
-        <w:rPr>
-          <w:rFonts w:ascii="SutonnyMJ" w:eastAsia="SutonnyMJ" w:hAnsi="SutonnyMJ" w:cs="SutonnyMJ"/>
-          <w:b/>
-          <w:bCs/>
-          <w:color w:val="1A3A2A"/>
-          <w:sz w:val="21"/>
-          <w:szCs w:val="21"/>
-        </w:rPr>
-        <w:t>ব্যাপারে</w:t>
-      </w:r>
-      <w:proofErr w:type="spellEnd"/>
-      <w:r>
-        <w:rPr>
-          <w:rFonts w:ascii="SutonnyMJ" w:eastAsia="SutonnyMJ" w:hAnsi="SutonnyMJ" w:cs="SutonnyMJ"/>
-          <w:b/>
-          <w:bCs/>
-          <w:color w:val="1A3A2A"/>
-          <w:sz w:val="21"/>
-          <w:szCs w:val="21"/>
-        </w:rPr>
-        <w:t xml:space="preserve"> </w:t>
-      </w:r>
-      <w:proofErr w:type="spellStart"/>
-      <w:r>
-        <w:rPr>
-          <w:rFonts w:ascii="SutonnyMJ" w:eastAsia="SutonnyMJ" w:hAnsi="SutonnyMJ" w:cs="SutonnyMJ"/>
-          <w:b/>
-          <w:bCs/>
-          <w:color w:val="1A3A2A"/>
-          <w:sz w:val="21"/>
-          <w:szCs w:val="21"/>
-        </w:rPr>
-        <w:t>কোন</w:t>
-      </w:r>
-      <w:proofErr w:type="spellEnd"/>
-      <w:r>
-        <w:rPr>
-          <w:rFonts w:ascii="SutonnyMJ" w:eastAsia="SutonnyMJ" w:hAnsi="SutonnyMJ" w:cs="SutonnyMJ"/>
-          <w:b/>
-          <w:bCs/>
-          <w:color w:val="1A3A2A"/>
-          <w:sz w:val="21"/>
-          <w:szCs w:val="21"/>
-        </w:rPr>
-        <w:t xml:space="preserve"> </w:t>
-      </w:r>
-      <w:proofErr w:type="spellStart"/>
-      <w:r>
-        <w:rPr>
-          <w:rFonts w:ascii="SutonnyMJ" w:eastAsia="SutonnyMJ" w:hAnsi="SutonnyMJ" w:cs="SutonnyMJ"/>
-          <w:b/>
-          <w:bCs/>
-          <w:color w:val="1A3A2A"/>
-          <w:sz w:val="21"/>
-          <w:szCs w:val="21"/>
-        </w:rPr>
-        <w:t>জিজ্ঞাসা</w:t>
-      </w:r>
-      <w:proofErr w:type="spellEnd"/>
-      <w:r>
-        <w:rPr>
-          <w:rFonts w:ascii="SutonnyMJ" w:eastAsia="SutonnyMJ" w:hAnsi="SutonnyMJ" w:cs="SutonnyMJ"/>
-          <w:b/>
-          <w:bCs/>
-          <w:color w:val="1A3A2A"/>
-          <w:sz w:val="21"/>
-          <w:szCs w:val="21"/>
-        </w:rPr>
-        <w:t xml:space="preserve"> </w:t>
-      </w:r>
-      <w:proofErr w:type="spellStart"/>
-      <w:r>
-        <w:rPr>
-          <w:rFonts w:ascii="SutonnyMJ" w:eastAsia="SutonnyMJ" w:hAnsi="SutonnyMJ" w:cs="SutonnyMJ"/>
-          <w:b/>
-          <w:bCs/>
-          <w:color w:val="1A3A2A"/>
-          <w:sz w:val="21"/>
-          <w:szCs w:val="21"/>
-        </w:rPr>
-        <w:t>থাকলে</w:t>
-      </w:r>
-      <w:proofErr w:type="spellEnd"/>
-      <w:r>
-        <w:rPr>
-          <w:rFonts w:ascii="SutonnyMJ" w:eastAsia="SutonnyMJ" w:hAnsi="SutonnyMJ" w:cs="SutonnyMJ"/>
-          <w:b/>
-          <w:bCs/>
-          <w:color w:val="1A3A2A"/>
-          <w:sz w:val="21"/>
-          <w:szCs w:val="21"/>
-        </w:rPr>
-        <w:t xml:space="preserve"> </w:t>
-      </w:r>
-      <w:proofErr w:type="spellStart"/>
-      <w:r>
-        <w:rPr>
-          <w:rFonts w:ascii="SutonnyMJ" w:eastAsia="SutonnyMJ" w:hAnsi="SutonnyMJ" w:cs="SutonnyMJ"/>
-          <w:b/>
-          <w:bCs/>
-          <w:color w:val="1A3A2A"/>
-          <w:sz w:val="21"/>
-          <w:szCs w:val="21"/>
-        </w:rPr>
-        <w:t>প্রয়োজনে</w:t>
-      </w:r>
-      <w:proofErr w:type="spellEnd"/>
-      <w:r>
-        <w:rPr>
-          <w:rFonts w:ascii="SutonnyMJ" w:eastAsia="SutonnyMJ" w:hAnsi="SutonnyMJ" w:cs="SutonnyMJ"/>
-          <w:b/>
-          <w:bCs/>
-          <w:color w:val="1A3A2A"/>
-          <w:sz w:val="21"/>
-          <w:szCs w:val="21"/>
-        </w:rPr>
-        <w:t xml:space="preserve"> </w:t>
-      </w:r>
-      <w:proofErr w:type="spellStart"/>
-      <w:r>
-        <w:rPr>
-          <w:rFonts w:ascii="SutonnyMJ" w:eastAsia="SutonnyMJ" w:hAnsi="SutonnyMJ" w:cs="SutonnyMJ"/>
-          <w:b/>
-          <w:bCs/>
-          <w:color w:val="1A3A2A"/>
-          <w:sz w:val="21"/>
-          <w:szCs w:val="21"/>
-        </w:rPr>
-        <w:t>যোগাযোগ</w:t>
-      </w:r>
-      <w:proofErr w:type="spellEnd"/>
-      <w:r>
-        <w:rPr>
-          <w:rFonts w:ascii="SutonnyMJ" w:eastAsia="SutonnyMJ" w:hAnsi="SutonnyMJ" w:cs="SutonnyMJ"/>
-          <w:b/>
-          <w:bCs/>
-          <w:color w:val="1A3A2A"/>
-          <w:sz w:val="21"/>
-          <w:szCs w:val="21"/>
-        </w:rPr>
-        <w:t xml:space="preserve"> </w:t>
-      </w:r>
-      <w:proofErr w:type="spellStart"/>
-      <w:r>
-        <w:rPr>
-          <w:rFonts w:ascii="SutonnyMJ" w:eastAsia="SutonnyMJ" w:hAnsi="SutonnyMJ" w:cs="SutonnyMJ"/>
-          <w:b/>
-          <w:bCs/>
-          <w:color w:val="1A3A2A"/>
-          <w:sz w:val="21"/>
-          <w:szCs w:val="21"/>
-        </w:rPr>
-        <w:t>করা</w:t>
-      </w:r>
-      <w:proofErr w:type="spellEnd"/>
-      <w:r>
-        <w:rPr>
-          <w:rFonts w:ascii="SutonnyMJ" w:eastAsia="SutonnyMJ" w:hAnsi="SutonnyMJ" w:cs="SutonnyMJ"/>
-          <w:b/>
-          <w:bCs/>
-          <w:color w:val="1A3A2A"/>
-          <w:sz w:val="21"/>
-          <w:szCs w:val="21"/>
-        </w:rPr>
-        <w:t xml:space="preserve"> </w:t>
-      </w:r>
-      <w:proofErr w:type="spellStart"/>
-      <w:r>
-        <w:rPr>
-          <w:rFonts w:ascii="SutonnyMJ" w:eastAsia="SutonnyMJ" w:hAnsi="SutonnyMJ" w:cs="SutonnyMJ"/>
-          <w:b/>
-          <w:bCs/>
-          <w:color w:val="1A3A2A"/>
-          <w:sz w:val="21"/>
-          <w:szCs w:val="21"/>
-        </w:rPr>
-        <w:t>যেতে</w:t>
-      </w:r>
-      <w:proofErr w:type="spellEnd"/>
-      <w:r>
-        <w:rPr>
-          <w:rFonts w:ascii="SutonnyMJ" w:eastAsia="SutonnyMJ" w:hAnsi="SutonnyMJ" w:cs="SutonnyMJ"/>
-          <w:b/>
-          <w:bCs/>
-          <w:color w:val="1A3A2A"/>
-          <w:sz w:val="21"/>
-          <w:szCs w:val="21"/>
-        </w:rPr>
-        <w:t xml:space="preserve"> </w:t>
-      </w:r>
-      <w:proofErr w:type="spellStart"/>
-      <w:r>
-        <w:rPr>
-          <w:rFonts w:ascii="SutonnyMJ" w:eastAsia="SutonnyMJ" w:hAnsi="SutonnyMJ" w:cs="SutonnyMJ"/>
-          <w:b/>
-          <w:bCs/>
-          <w:color w:val="1A3A2A"/>
-          <w:sz w:val="21"/>
-          <w:szCs w:val="21"/>
-        </w:rPr>
-        <w:t>পারে</w:t>
-      </w:r>
-      <w:proofErr w:type="spellEnd"/>
-      <w:r>
-        <w:rPr>
-          <w:rFonts w:ascii="SutonnyMJ" w:eastAsia="SutonnyMJ" w:hAnsi="SutonnyMJ" w:cs="SutonnyMJ"/>
-          <w:b/>
-          <w:bCs/>
-          <w:color w:val="1A3A2A"/>
-          <w:sz w:val="21"/>
-          <w:szCs w:val="21"/>
-        </w:rPr>
-        <w:t>।</w:t>
       </w:r>
     </w:p>
     <w:p>
@@ -3020,68 +2534,552 @@
           <w:rFonts w:ascii="SutonnyMJ" w:eastAsia="SutonnyMJ" w:hAnsi="SutonnyMJ" w:cs="SutonnyMJ"/>
           <w:b/>
           <w:bCs/>
-          <w:color w:val="2E6B45"/>
-        </w:rPr>
-        <w:lastRenderedPageBreak/>
-        <w:t>আল্লাহ</w:t>
-      </w:r>
-      <w:proofErr w:type="spellEnd"/>
+          <w:color w:val="1A3A2A"/>
+          <w:sz w:val="21"/>
+          <w:szCs w:val="21"/>
+        </w:rPr>
+        <w:t>বিঃ</w:t>
+      </w:r>
+      <w:proofErr w:type="spellEnd"/>
+      <w:r>
+        <w:rPr>
+          <w:rFonts w:ascii="SutonnyMJ" w:eastAsia="SutonnyMJ" w:hAnsi="SutonnyMJ" w:cs="SutonnyMJ"/>
+          <w:b/>
+          <w:bCs/>
+          <w:color w:val="1A3A2A"/>
+          <w:sz w:val="21"/>
+          <w:szCs w:val="21"/>
+        </w:rPr>
+        <w:t xml:space="preserve"> </w:t>
+      </w:r>
+      <w:proofErr w:type="spellStart"/>
+      <w:r>
+        <w:rPr>
+          <w:rFonts w:ascii="SutonnyMJ" w:eastAsia="SutonnyMJ" w:hAnsi="SutonnyMJ" w:cs="SutonnyMJ"/>
+          <w:b/>
+          <w:bCs/>
+          <w:color w:val="1A3A2A"/>
+          <w:sz w:val="21"/>
+          <w:szCs w:val="21"/>
+        </w:rPr>
+        <w:t>দ্রঃ</w:t>
+      </w:r>
+      <w:proofErr w:type="spellEnd"/>
+      <w:r>
+        <w:rPr>
+          <w:rFonts w:ascii="SutonnyMJ" w:eastAsia="SutonnyMJ" w:hAnsi="SutonnyMJ" w:cs="SutonnyMJ"/>
+          <w:b/>
+          <w:bCs/>
+          <w:color w:val="1A3A2A"/>
+          <w:sz w:val="21"/>
+          <w:szCs w:val="21"/>
+        </w:rPr>
+        <w:t xml:space="preserve"> </w:t>
+      </w:r>
+      <w:proofErr w:type="spellStart"/>
+      <w:r>
+        <w:rPr>
+          <w:rFonts w:ascii="SutonnyMJ" w:eastAsia="SutonnyMJ" w:hAnsi="SutonnyMJ" w:cs="SutonnyMJ"/>
+          <w:b/>
+          <w:bCs/>
+          <w:color w:val="1A3A2A"/>
+          <w:sz w:val="21"/>
+          <w:szCs w:val="21"/>
+        </w:rPr>
+        <w:t>যাকাতের</w:t>
+      </w:r>
+      <w:proofErr w:type="spellEnd"/>
+      <w:r>
+        <w:rPr>
+          <w:rFonts w:ascii="SutonnyMJ" w:eastAsia="SutonnyMJ" w:hAnsi="SutonnyMJ" w:cs="SutonnyMJ"/>
+          <w:b/>
+          <w:bCs/>
+          <w:color w:val="1A3A2A"/>
+          <w:sz w:val="21"/>
+          <w:szCs w:val="21"/>
+        </w:rPr>
+        <w:t xml:space="preserve"> </w:t>
+      </w:r>
+      <w:proofErr w:type="spellStart"/>
+      <w:r>
+        <w:rPr>
+          <w:rFonts w:ascii="SutonnyMJ" w:eastAsia="SutonnyMJ" w:hAnsi="SutonnyMJ" w:cs="SutonnyMJ"/>
+          <w:b/>
+          <w:bCs/>
+          <w:color w:val="1A3A2A"/>
+          <w:sz w:val="21"/>
+          <w:szCs w:val="21"/>
+        </w:rPr>
+        <w:t>অর্থ</w:t>
+      </w:r>
+      <w:proofErr w:type="spellEnd"/>
+      <w:r>
+        <w:rPr>
+          <w:rFonts w:ascii="SutonnyMJ" w:eastAsia="SutonnyMJ" w:hAnsi="SutonnyMJ" w:cs="SutonnyMJ"/>
+          <w:b/>
+          <w:bCs/>
+          <w:color w:val="1A3A2A"/>
+          <w:sz w:val="21"/>
+          <w:szCs w:val="21"/>
+        </w:rPr>
+        <w:t xml:space="preserve"> </w:t>
+      </w:r>
+      <w:proofErr w:type="spellStart"/>
+      <w:r>
+        <w:rPr>
+          <w:rFonts w:ascii="SutonnyMJ" w:eastAsia="SutonnyMJ" w:hAnsi="SutonnyMJ" w:cs="SutonnyMJ"/>
+          <w:b/>
+          <w:bCs/>
+          <w:color w:val="1A3A2A"/>
+          <w:sz w:val="21"/>
+          <w:szCs w:val="21"/>
+        </w:rPr>
+        <w:t>যাকাতের</w:t>
+      </w:r>
+      <w:proofErr w:type="spellEnd"/>
+      <w:r>
+        <w:rPr>
+          <w:rFonts w:ascii="SutonnyMJ" w:eastAsia="SutonnyMJ" w:hAnsi="SutonnyMJ" w:cs="SutonnyMJ"/>
+          <w:b/>
+          <w:bCs/>
+          <w:color w:val="1A3A2A"/>
+          <w:sz w:val="21"/>
+          <w:szCs w:val="21"/>
+        </w:rPr>
+        <w:t xml:space="preserve"> </w:t>
+      </w:r>
+      <w:proofErr w:type="spellStart"/>
+      <w:r>
+        <w:rPr>
+          <w:rFonts w:ascii="SutonnyMJ" w:eastAsia="SutonnyMJ" w:hAnsi="SutonnyMJ" w:cs="SutonnyMJ"/>
+          <w:b/>
+          <w:bCs/>
+          <w:color w:val="1A3A2A"/>
+          <w:sz w:val="21"/>
+          <w:szCs w:val="21"/>
+        </w:rPr>
+        <w:t>নির্ধারিত</w:t>
+      </w:r>
+      <w:proofErr w:type="spellEnd"/>
+      <w:r>
+        <w:rPr>
+          <w:rFonts w:ascii="SutonnyMJ" w:eastAsia="SutonnyMJ" w:hAnsi="SutonnyMJ" w:cs="SutonnyMJ"/>
+          <w:b/>
+          <w:bCs/>
+          <w:color w:val="1A3A2A"/>
+          <w:sz w:val="21"/>
+          <w:szCs w:val="21"/>
+        </w:rPr>
+        <w:t xml:space="preserve"> </w:t>
+      </w:r>
+      <w:proofErr w:type="spellStart"/>
+      <w:r>
+        <w:rPr>
+          <w:rFonts w:ascii="SutonnyMJ" w:eastAsia="SutonnyMJ" w:hAnsi="SutonnyMJ" w:cs="SutonnyMJ"/>
+          <w:b/>
+          <w:bCs/>
+          <w:color w:val="1A3A2A"/>
+          <w:sz w:val="21"/>
+          <w:szCs w:val="21"/>
+        </w:rPr>
+        <w:t>খাতে</w:t>
+      </w:r>
+      <w:proofErr w:type="spellEnd"/>
+      <w:r>
+        <w:rPr>
+          <w:rFonts w:ascii="SutonnyMJ" w:eastAsia="SutonnyMJ" w:hAnsi="SutonnyMJ" w:cs="SutonnyMJ"/>
+          <w:b/>
+          <w:bCs/>
+          <w:color w:val="1A3A2A"/>
+          <w:sz w:val="21"/>
+          <w:szCs w:val="21"/>
+        </w:rPr>
+        <w:t xml:space="preserve"> </w:t>
+      </w:r>
+      <w:proofErr w:type="spellStart"/>
+      <w:r>
+        <w:rPr>
+          <w:rFonts w:ascii="SutonnyMJ" w:eastAsia="SutonnyMJ" w:hAnsi="SutonnyMJ" w:cs="SutonnyMJ"/>
+          <w:b/>
+          <w:bCs/>
+          <w:color w:val="1A3A2A"/>
+          <w:sz w:val="21"/>
+          <w:szCs w:val="21"/>
+        </w:rPr>
+        <w:t>ব্যয়</w:t>
+      </w:r>
+      <w:proofErr w:type="spellEnd"/>
+      <w:r>
+        <w:rPr>
+          <w:rFonts w:ascii="SutonnyMJ" w:eastAsia="SutonnyMJ" w:hAnsi="SutonnyMJ" w:cs="SutonnyMJ"/>
+          <w:b/>
+          <w:bCs/>
+          <w:color w:val="1A3A2A"/>
+          <w:sz w:val="21"/>
+          <w:szCs w:val="21"/>
+        </w:rPr>
+        <w:t xml:space="preserve"> </w:t>
+      </w:r>
+      <w:proofErr w:type="spellStart"/>
+      <w:r>
+        <w:rPr>
+          <w:rFonts w:ascii="SutonnyMJ" w:eastAsia="SutonnyMJ" w:hAnsi="SutonnyMJ" w:cs="SutonnyMJ"/>
+          <w:b/>
+          <w:bCs/>
+          <w:color w:val="1A3A2A"/>
+          <w:sz w:val="21"/>
+          <w:szCs w:val="21"/>
+        </w:rPr>
+        <w:t>করতে</w:t>
+      </w:r>
+      <w:proofErr w:type="spellEnd"/>
+      <w:r>
+        <w:rPr>
+          <w:rFonts w:ascii="SutonnyMJ" w:eastAsia="SutonnyMJ" w:hAnsi="SutonnyMJ" w:cs="SutonnyMJ"/>
+          <w:b/>
+          <w:bCs/>
+          <w:color w:val="1A3A2A"/>
+          <w:sz w:val="21"/>
+          <w:szCs w:val="21"/>
+        </w:rPr>
+        <w:t xml:space="preserve"> </w:t>
+      </w:r>
+      <w:proofErr w:type="spellStart"/>
+      <w:r>
+        <w:rPr>
+          <w:rFonts w:ascii="SutonnyMJ" w:eastAsia="SutonnyMJ" w:hAnsi="SutonnyMJ" w:cs="SutonnyMJ"/>
+          <w:b/>
+          <w:bCs/>
+          <w:color w:val="1A3A2A"/>
+          <w:sz w:val="21"/>
+          <w:szCs w:val="21"/>
+        </w:rPr>
+        <w:t>হবে</w:t>
+      </w:r>
+      <w:proofErr w:type="spellEnd"/>
+      <w:r>
+        <w:rPr>
+          <w:rFonts w:ascii="SutonnyMJ" w:eastAsia="SutonnyMJ" w:hAnsi="SutonnyMJ" w:cs="SutonnyMJ"/>
+          <w:b/>
+          <w:bCs/>
+          <w:color w:val="1A3A2A"/>
+          <w:sz w:val="21"/>
+          <w:szCs w:val="21"/>
+        </w:rPr>
+        <w:t xml:space="preserve">। এ </w:t>
+      </w:r>
+      <w:proofErr w:type="spellStart"/>
+      <w:r>
+        <w:rPr>
+          <w:rFonts w:ascii="SutonnyMJ" w:eastAsia="SutonnyMJ" w:hAnsi="SutonnyMJ" w:cs="SutonnyMJ"/>
+          <w:b/>
+          <w:bCs/>
+          <w:color w:val="1A3A2A"/>
+          <w:sz w:val="21"/>
+          <w:szCs w:val="21"/>
+        </w:rPr>
+        <w:t>ব্যাপারে</w:t>
+      </w:r>
+      <w:proofErr w:type="spellEnd"/>
+      <w:r>
+        <w:rPr>
+          <w:rFonts w:ascii="SutonnyMJ" w:eastAsia="SutonnyMJ" w:hAnsi="SutonnyMJ" w:cs="SutonnyMJ"/>
+          <w:b/>
+          <w:bCs/>
+          <w:color w:val="1A3A2A"/>
+          <w:sz w:val="21"/>
+          <w:szCs w:val="21"/>
+        </w:rPr>
+        <w:t xml:space="preserve"> </w:t>
+      </w:r>
+      <w:proofErr w:type="spellStart"/>
+      <w:r>
+        <w:rPr>
+          <w:rFonts w:ascii="SutonnyMJ" w:eastAsia="SutonnyMJ" w:hAnsi="SutonnyMJ" w:cs="SutonnyMJ"/>
+          <w:b/>
+          <w:bCs/>
+          <w:color w:val="1A3A2A"/>
+          <w:sz w:val="21"/>
+          <w:szCs w:val="21"/>
+        </w:rPr>
+        <w:t>কোন</w:t>
+      </w:r>
+      <w:proofErr w:type="spellEnd"/>
+      <w:r>
+        <w:rPr>
+          <w:rFonts w:ascii="SutonnyMJ" w:eastAsia="SutonnyMJ" w:hAnsi="SutonnyMJ" w:cs="SutonnyMJ"/>
+          <w:b/>
+          <w:bCs/>
+          <w:color w:val="1A3A2A"/>
+          <w:sz w:val="21"/>
+          <w:szCs w:val="21"/>
+        </w:rPr>
+        <w:t xml:space="preserve"> </w:t>
+      </w:r>
+      <w:proofErr w:type="spellStart"/>
+      <w:r>
+        <w:rPr>
+          <w:rFonts w:ascii="SutonnyMJ" w:eastAsia="SutonnyMJ" w:hAnsi="SutonnyMJ" w:cs="SutonnyMJ"/>
+          <w:b/>
+          <w:bCs/>
+          <w:color w:val="1A3A2A"/>
+          <w:sz w:val="21"/>
+          <w:szCs w:val="21"/>
+        </w:rPr>
+        <w:t>জিজ্ঞাসা</w:t>
+      </w:r>
+      <w:proofErr w:type="spellEnd"/>
+      <w:r>
+        <w:rPr>
+          <w:rFonts w:ascii="SutonnyMJ" w:eastAsia="SutonnyMJ" w:hAnsi="SutonnyMJ" w:cs="SutonnyMJ"/>
+          <w:b/>
+          <w:bCs/>
+          <w:color w:val="1A3A2A"/>
+          <w:sz w:val="21"/>
+          <w:szCs w:val="21"/>
+        </w:rPr>
+        <w:t xml:space="preserve"> </w:t>
+      </w:r>
+      <w:proofErr w:type="spellStart"/>
+      <w:r>
+        <w:rPr>
+          <w:rFonts w:ascii="SutonnyMJ" w:eastAsia="SutonnyMJ" w:hAnsi="SutonnyMJ" w:cs="SutonnyMJ"/>
+          <w:b/>
+          <w:bCs/>
+          <w:color w:val="1A3A2A"/>
+          <w:sz w:val="21"/>
+          <w:szCs w:val="21"/>
+        </w:rPr>
+        <w:t>থাকলে</w:t>
+      </w:r>
+      <w:proofErr w:type="spellEnd"/>
+      <w:r>
+        <w:rPr>
+          <w:rFonts w:ascii="SutonnyMJ" w:eastAsia="SutonnyMJ" w:hAnsi="SutonnyMJ" w:cs="SutonnyMJ"/>
+          <w:b/>
+          <w:bCs/>
+          <w:color w:val="1A3A2A"/>
+          <w:sz w:val="21"/>
+          <w:szCs w:val="21"/>
+        </w:rPr>
+        <w:t xml:space="preserve"> </w:t>
+      </w:r>
+      <w:proofErr w:type="spellStart"/>
+      <w:r>
+        <w:rPr>
+          <w:rFonts w:ascii="SutonnyMJ" w:eastAsia="SutonnyMJ" w:hAnsi="SutonnyMJ" w:cs="SutonnyMJ"/>
+          <w:b/>
+          <w:bCs/>
+          <w:color w:val="1A3A2A"/>
+          <w:sz w:val="21"/>
+          <w:szCs w:val="21"/>
+        </w:rPr>
+        <w:t>প্রয়োজনে</w:t>
+      </w:r>
+      <w:proofErr w:type="spellEnd"/>
+      <w:r>
+        <w:rPr>
+          <w:rFonts w:ascii="SutonnyMJ" w:eastAsia="SutonnyMJ" w:hAnsi="SutonnyMJ" w:cs="SutonnyMJ"/>
+          <w:b/>
+          <w:bCs/>
+          <w:color w:val="1A3A2A"/>
+          <w:sz w:val="21"/>
+          <w:szCs w:val="21"/>
+        </w:rPr>
+        <w:t xml:space="preserve"> </w:t>
+      </w:r>
+      <w:proofErr w:type="spellStart"/>
+      <w:r>
+        <w:rPr>
+          <w:rFonts w:ascii="SutonnyMJ" w:eastAsia="SutonnyMJ" w:hAnsi="SutonnyMJ" w:cs="SutonnyMJ"/>
+          <w:b/>
+          <w:bCs/>
+          <w:color w:val="1A3A2A"/>
+          <w:sz w:val="21"/>
+          <w:szCs w:val="21"/>
+        </w:rPr>
+        <w:t>যোগাযোগ</w:t>
+      </w:r>
+      <w:proofErr w:type="spellEnd"/>
+      <w:r>
+        <w:rPr>
+          <w:rFonts w:ascii="SutonnyMJ" w:eastAsia="SutonnyMJ" w:hAnsi="SutonnyMJ" w:cs="SutonnyMJ"/>
+          <w:b/>
+          <w:bCs/>
+          <w:color w:val="1A3A2A"/>
+          <w:sz w:val="21"/>
+          <w:szCs w:val="21"/>
+        </w:rPr>
+        <w:t xml:space="preserve"> </w:t>
+      </w:r>
+      <w:proofErr w:type="spellStart"/>
+      <w:r>
+        <w:rPr>
+          <w:rFonts w:ascii="SutonnyMJ" w:eastAsia="SutonnyMJ" w:hAnsi="SutonnyMJ" w:cs="SutonnyMJ"/>
+          <w:b/>
+          <w:bCs/>
+          <w:color w:val="1A3A2A"/>
+          <w:sz w:val="21"/>
+          <w:szCs w:val="21"/>
+        </w:rPr>
+        <w:t>করা</w:t>
+      </w:r>
+      <w:proofErr w:type="spellEnd"/>
+      <w:r>
+        <w:rPr>
+          <w:rFonts w:ascii="SutonnyMJ" w:eastAsia="SutonnyMJ" w:hAnsi="SutonnyMJ" w:cs="SutonnyMJ"/>
+          <w:b/>
+          <w:bCs/>
+          <w:color w:val="1A3A2A"/>
+          <w:sz w:val="21"/>
+          <w:szCs w:val="21"/>
+        </w:rPr>
+        <w:t xml:space="preserve"> </w:t>
+      </w:r>
+      <w:proofErr w:type="spellStart"/>
+      <w:r>
+        <w:rPr>
+          <w:rFonts w:ascii="SutonnyMJ" w:eastAsia="SutonnyMJ" w:hAnsi="SutonnyMJ" w:cs="SutonnyMJ"/>
+          <w:b/>
+          <w:bCs/>
+          <w:color w:val="1A3A2A"/>
+          <w:sz w:val="21"/>
+          <w:szCs w:val="21"/>
+        </w:rPr>
+        <w:t>যেতে</w:t>
+      </w:r>
+      <w:proofErr w:type="spellEnd"/>
+      <w:r>
+        <w:rPr>
+          <w:rFonts w:ascii="SutonnyMJ" w:eastAsia="SutonnyMJ" w:hAnsi="SutonnyMJ" w:cs="SutonnyMJ"/>
+          <w:b/>
+          <w:bCs/>
+          <w:color w:val="1A3A2A"/>
+          <w:sz w:val="21"/>
+          <w:szCs w:val="21"/>
+        </w:rPr>
+        <w:t xml:space="preserve"> </w:t>
+      </w:r>
+      <w:proofErr w:type="spellStart"/>
+      <w:r>
+        <w:rPr>
+          <w:rFonts w:ascii="SutonnyMJ" w:eastAsia="SutonnyMJ" w:hAnsi="SutonnyMJ" w:cs="SutonnyMJ"/>
+          <w:b/>
+          <w:bCs/>
+          <w:color w:val="1A3A2A"/>
+          <w:sz w:val="21"/>
+          <w:szCs w:val="21"/>
+        </w:rPr>
+        <w:t>পারে</w:t>
+      </w:r>
+      <w:proofErr w:type="spellEnd"/>
+      <w:r>
+        <w:rPr>
+          <w:rFonts w:ascii="SutonnyMJ" w:eastAsia="SutonnyMJ" w:hAnsi="SutonnyMJ" w:cs="SutonnyMJ"/>
+          <w:b/>
+          <w:bCs/>
+          <w:color w:val="1A3A2A"/>
+          <w:sz w:val="21"/>
+          <w:szCs w:val="21"/>
+        </w:rPr>
+        <w:t>।</w:t>
+      </w:r>
+    </w:p>
+    <w:p>
+      <w:pPr>
+        <w:spacing w:after="80"/>
+      </w:pPr>
+    </w:p>
+    <w:p>
+      <w:pPr>
+        <w:spacing w:before="60" w:after="60" w:line="340" w:lineRule="auto"/>
+        <w:jc w:val="center"/>
+        <w:rPr>
+          <w:sz w:val="24"/>
+          <w:szCs w:val="24"/>
+        </w:rPr>
+      </w:pPr>
+      <w:proofErr w:type="spellStart"/>
       <w:r>
         <w:rPr>
           <w:rFonts w:ascii="SutonnyMJ" w:eastAsia="SutonnyMJ" w:hAnsi="SutonnyMJ" w:cs="SutonnyMJ"/>
           <w:b/>
           <w:bCs/>
           <w:color w:val="2E6B45"/>
-        </w:rPr>
-        <w:t xml:space="preserve"> </w:t>
-      </w:r>
-      <w:proofErr w:type="spellStart"/>
+          <w:sz w:val="24"/>
+          <w:szCs w:val="24"/>
+        </w:rPr>
+        <w:t>আল্লাহ</w:t>
+      </w:r>
+      <w:proofErr w:type="spellEnd"/>
       <w:r>
         <w:rPr>
           <w:rFonts w:ascii="SutonnyMJ" w:eastAsia="SutonnyMJ" w:hAnsi="SutonnyMJ" w:cs="SutonnyMJ"/>
           <w:b/>
           <w:bCs/>
           <w:color w:val="2E6B45"/>
-        </w:rPr>
-        <w:t>তায়ালাই</w:t>
-      </w:r>
-      <w:proofErr w:type="spellEnd"/>
+          <w:sz w:val="24"/>
+          <w:szCs w:val="24"/>
+        </w:rPr>
+        <w:t xml:space="preserve"> </w:t>
+      </w:r>
+      <w:proofErr w:type="spellStart"/>
       <w:r>
         <w:rPr>
           <w:rFonts w:ascii="SutonnyMJ" w:eastAsia="SutonnyMJ" w:hAnsi="SutonnyMJ" w:cs="SutonnyMJ"/>
           <w:b/>
           <w:bCs/>
           <w:color w:val="2E6B45"/>
-        </w:rPr>
-        <w:t xml:space="preserve"> </w:t>
-      </w:r>
-      <w:proofErr w:type="spellStart"/>
+          <w:sz w:val="24"/>
+          <w:szCs w:val="24"/>
+        </w:rPr>
+        <w:t>তায়ালাই</w:t>
+      </w:r>
+      <w:proofErr w:type="spellEnd"/>
       <w:r>
         <w:rPr>
           <w:rFonts w:ascii="SutonnyMJ" w:eastAsia="SutonnyMJ" w:hAnsi="SutonnyMJ" w:cs="SutonnyMJ"/>
           <w:b/>
           <w:bCs/>
           <w:color w:val="2E6B45"/>
-        </w:rPr>
-        <w:t>সর্বাধিক</w:t>
-      </w:r>
-      <w:proofErr w:type="spellEnd"/>
+          <w:sz w:val="24"/>
+          <w:szCs w:val="24"/>
+        </w:rPr>
+        <w:t xml:space="preserve"> </w:t>
+      </w:r>
+      <w:proofErr w:type="spellStart"/>
       <w:r>
         <w:rPr>
           <w:rFonts w:ascii="SutonnyMJ" w:eastAsia="SutonnyMJ" w:hAnsi="SutonnyMJ" w:cs="SutonnyMJ"/>
           <w:b/>
           <w:bCs/>
           <w:color w:val="2E6B45"/>
-        </w:rPr>
-        <w:t xml:space="preserve"> </w:t>
-      </w:r>
-      <w:proofErr w:type="spellStart"/>
+          <w:sz w:val="24"/>
+          <w:szCs w:val="24"/>
+        </w:rPr>
+        <w:t>সর্বাধিক</w:t>
+      </w:r>
+      <w:proofErr w:type="spellEnd"/>
       <w:r>
         <w:rPr>
           <w:rFonts w:ascii="SutonnyMJ" w:eastAsia="SutonnyMJ" w:hAnsi="SutonnyMJ" w:cs="SutonnyMJ"/>
           <w:b/>
           <w:bCs/>
           <w:color w:val="2E6B45"/>
+          <w:sz w:val="24"/>
+          <w:szCs w:val="24"/>
+        </w:rPr>
+        <w:t xml:space="preserve"> </w:t>
+      </w:r>
+      <w:proofErr w:type="spellStart"/>
+      <w:r>
+        <w:rPr>
+          <w:rFonts w:ascii="SutonnyMJ" w:eastAsia="SutonnyMJ" w:hAnsi="SutonnyMJ" w:cs="SutonnyMJ"/>
+          <w:b/>
+          <w:bCs/>
+          <w:color w:val="2E6B45"/>
+          <w:sz w:val="24"/>
+          <w:szCs w:val="24"/>
         </w:rPr>
         <w:t>জ্ঞাত</w:t>
       </w:r>
@@ -3113,12 +3111,6 @@
         <w:gridCol w:w="10029"/>
       </w:tblGrid>
       <w:tr>
-        <w:tblPrEx>
-          <w:tblCellMar>
-            <w:top w:w="0" w:type="dxa"/>
-            <w:bottom w:w="0" w:type="dxa"/>
-          </w:tblCellMar>
-        </w:tblPrEx>
         <w:trPr>
           <w:trHeight w:val="575"/>
         </w:trPr>
@@ -3296,12 +3288,6 @@
         <w:gridCol w:w="10008"/>
       </w:tblGrid>
       <w:tr>
-        <w:tblPrEx>
-          <w:tblCellMar>
-            <w:top w:w="0" w:type="dxa"/>
-            <w:bottom w:w="0" w:type="dxa"/>
-          </w:tblCellMar>
-        </w:tblPrEx>
         <w:trPr>
           <w:trHeight w:val="316"/>
         </w:trPr>
@@ -3414,12 +3400,6 @@
         <w:gridCol w:w="9360"/>
       </w:tblGrid>
       <w:tr>
-        <w:tblPrEx>
-          <w:tblCellMar>
-            <w:top w:w="0" w:type="dxa"/>
-            <w:bottom w:w="0" w:type="dxa"/>
-          </w:tblCellMar>
-        </w:tblPrEx>
         <w:tc>
           <w:tcPr>
             <w:tcW w:w="0" w:type="auto"/>
@@ -3874,12 +3854,6 @@
         <w:gridCol w:w="9360"/>
       </w:tblGrid>
       <w:tr>
-        <w:tblPrEx>
-          <w:tblCellMar>
-            <w:top w:w="0" w:type="dxa"/>
-            <w:bottom w:w="0" w:type="dxa"/>
-          </w:tblCellMar>
-        </w:tblPrEx>
         <w:tc>
           <w:tcPr>
             <w:tcW w:w="0" w:type="auto"/>
@@ -4230,12 +4204,6 @@
         <w:gridCol w:w="9360"/>
       </w:tblGrid>
       <w:tr>
-        <w:tblPrEx>
-          <w:tblCellMar>
-            <w:top w:w="0" w:type="dxa"/>
-            <w:bottom w:w="0" w:type="dxa"/>
-          </w:tblCellMar>
-        </w:tblPrEx>
         <w:tc>
           <w:tcPr>
             <w:tcW w:w="0" w:type="auto"/>
@@ -4830,12 +4798,6 @@
         <w:gridCol w:w="9360"/>
       </w:tblGrid>
       <w:tr>
-        <w:tblPrEx>
-          <w:tblCellMar>
-            <w:top w:w="0" w:type="dxa"/>
-            <w:bottom w:w="0" w:type="dxa"/>
-          </w:tblCellMar>
-        </w:tblPrEx>
         <w:tc>
           <w:tcPr>
             <w:tcW w:w="0" w:type="auto"/>
@@ -5418,12 +5380,6 @@
         <w:gridCol w:w="9360"/>
       </w:tblGrid>
       <w:tr>
-        <w:tblPrEx>
-          <w:tblCellMar>
-            <w:top w:w="0" w:type="dxa"/>
-            <w:bottom w:w="0" w:type="dxa"/>
-          </w:tblCellMar>
-        </w:tblPrEx>
         <w:tc>
           <w:tcPr>
             <w:tcW w:w="0" w:type="auto"/>
@@ -5581,12 +5537,6 @@
         <w:gridCol w:w="9360"/>
       </w:tblGrid>
       <w:tr>
-        <w:tblPrEx>
-          <w:tblCellMar>
-            <w:top w:w="0" w:type="dxa"/>
-            <w:bottom w:w="0" w:type="dxa"/>
-          </w:tblCellMar>
-        </w:tblPrEx>
         <w:tc>
           <w:tcPr>
             <w:tcW w:w="0" w:type="auto"/>
@@ -6345,12 +6295,6 @@
         <w:gridCol w:w="9360"/>
       </w:tblGrid>
       <w:tr>
-        <w:tblPrEx>
-          <w:tblCellMar>
-            <w:top w:w="0" w:type="dxa"/>
-            <w:bottom w:w="0" w:type="dxa"/>
-          </w:tblCellMar>
-        </w:tblPrEx>
         <w:tc>
           <w:tcPr>
             <w:tcW w:w="0" w:type="auto"/>
@@ -7150,12 +7094,6 @@
         <w:gridCol w:w="9360"/>
       </w:tblGrid>
       <w:tr>
-        <w:tblPrEx>
-          <w:tblCellMar>
-            <w:top w:w="0" w:type="dxa"/>
-            <w:bottom w:w="0" w:type="dxa"/>
-          </w:tblCellMar>
-        </w:tblPrEx>
         <w:tc>
           <w:tcPr>
             <w:tcW w:w="0" w:type="auto"/>
@@ -7650,12 +7588,6 @@
         <w:gridCol w:w="9360"/>
       </w:tblGrid>
       <w:tr>
-        <w:tblPrEx>
-          <w:tblCellMar>
-            <w:top w:w="0" w:type="dxa"/>
-            <w:bottom w:w="0" w:type="dxa"/>
-          </w:tblCellMar>
-        </w:tblPrEx>
         <w:tc>
           <w:tcPr>
             <w:tcW w:w="0" w:type="auto"/>
@@ -7837,12 +7769,6 @@
         <w:gridCol w:w="9360"/>
       </w:tblGrid>
       <w:tr>
-        <w:tblPrEx>
-          <w:tblCellMar>
-            <w:top w:w="0" w:type="dxa"/>
-            <w:bottom w:w="0" w:type="dxa"/>
-          </w:tblCellMar>
-        </w:tblPrEx>
         <w:tc>
           <w:tcPr>
             <w:tcW w:w="0" w:type="auto"/>
@@ -8409,12 +8335,6 @@
         <w:gridCol w:w="9360"/>
       </w:tblGrid>
       <w:tr>
-        <w:tblPrEx>
-          <w:tblCellMar>
-            <w:top w:w="0" w:type="dxa"/>
-            <w:bottom w:w="0" w:type="dxa"/>
-          </w:tblCellMar>
-        </w:tblPrEx>
         <w:tc>
           <w:tcPr>
             <w:tcW w:w="0" w:type="auto"/>
@@ -9935,12 +9855,6 @@
         <w:gridCol w:w="10260"/>
       </w:tblGrid>
       <w:tr>
-        <w:tblPrEx>
-          <w:tblCellMar>
-            <w:top w:w="0" w:type="dxa"/>
-            <w:bottom w:w="0" w:type="dxa"/>
-          </w:tblCellMar>
-        </w:tblPrEx>
         <w:trPr>
           <w:trHeight w:val="2535"/>
         </w:trPr>
@@ -11922,8 +11836,19 @@
                 <w:sz w:val="18"/>
                 <w:szCs w:val="18"/>
               </w:rPr>
-              <w:t>: https://forms.gle/DjBSKJCqXddahizr9</w:t>
-            </w:r>
+              <w:t xml:space="preserve">: </w:t>
+            </w:r>
+            <w:hyperlink r:id="rId7" w:history="1">
+              <w:r>
+                <w:rPr>
+                  <w:rStyle w:val="Hyperlink"/>
+                  <w:rFonts w:ascii="SutonnyMJ" w:eastAsia="SutonnyMJ" w:hAnsi="SutonnyMJ" w:cs="SutonnyMJ"/>
+                  <w:sz w:val="18"/>
+                  <w:szCs w:val="18"/>
+                </w:rPr>
+                <w:t>https://forms.gle/DjBSKJCqXddahizr9</w:t>
+              </w:r>
+            </w:hyperlink>
           </w:p>
         </w:tc>
       </w:tr>
@@ -12175,8 +12100,8 @@
       <w:proofErr w:type="spellEnd"/>
     </w:p>
     <w:sectPr>
-      <w:headerReference w:type="default" r:id="rId7"/>
-      <w:footerReference w:type="default" r:id="rId8"/>
+      <w:headerReference w:type="default" r:id="rId8"/>
+      <w:footerReference w:type="default" r:id="rId9"/>
       <w:pgSz w:w="12240" w:h="15840"/>
       <w:pgMar w:top="1000" w:right="1080" w:bottom="1000" w:left="1080" w:header="708" w:footer="708" w:gutter="0"/>
       <w:cols w:space="720"/>
@@ -12304,12 +12229,6 @@
       <w:gridCol w:w="3360"/>
     </w:tblGrid>
     <w:tr>
-      <w:tblPrEx>
-        <w:tblCellMar>
-          <w:top w:w="0" w:type="dxa"/>
-          <w:bottom w:w="0" w:type="dxa"/>
-        </w:tblCellMar>
-      </w:tblPrEx>
       <w:tc>
         <w:tcPr>
           <w:tcW w:w="6000" w:type="dxa"/>
@@ -13251,6 +13170,18 @@
       <w:szCs w:val="28"/>
     </w:rPr>
   </w:style>
+  <w:style w:type="character" w:styleId="UnresolvedMention">
+    <w:name w:val="Unresolved Mention"/>
+    <w:basedOn w:val="DefaultParagraphFont"/>
+    <w:uiPriority w:val="99"/>
+    <w:semiHidden/>
+    <w:unhideWhenUsed/>
+    <w:rsid w:val="00FB2094"/>
+    <w:rPr>
+      <w:color w:val="605E5C"/>
+      <w:shd w:val="clear" w:color="auto" w:fill="E1DFDD"/>
+    </w:rPr>
+  </w:style>
 </w:styles>
 </file>
 

</xml_diff>